<commit_message>
added patterns in hindi for standard and for screen reader
</commit_message>
<xml_diff>
--- a/crochet-curio/assets/patterns/rosie-beanie-pattern-large-print.docx
+++ b/crochet-curio/assets/patterns/rosie-beanie-pattern-large-print.docx
@@ -10,7 +10,7 @@
       </w:pPr>
       <w:r>
         <w:rPr>
-          <w:rFonts w:ascii="Verdana" w:cs="Verdana" w:eastAsia="Verdana" w:hAnsi="Verdana"/>
+          <w:rFonts w:ascii="Verdana" w:cs="Verdana" w:hAnsi="Verdana"/>
           <w:b/>
           <w:bCs/>
           <w:i w:val="false"/>
@@ -46,7 +46,7 @@
       </w:pPr>
       <w:r>
         <w:rPr>
-          <w:rFonts w:ascii="Verdana" w:cs="Verdana" w:eastAsia="Verdana" w:hAnsi="Verdana"/>
+          <w:rFonts w:ascii="Verdana" w:cs="Verdana" w:hAnsi="Verdana"/>
           <w:b/>
           <w:bCs/>
           <w:i w:val="false"/>
@@ -172,7 +172,7 @@
       <w:r>
         <w:t xml:space="preserve">If anything in this pattern is wrong, unclear, or does not read properly with your screen reader, please write to </w:t>
       </w:r>
-      <w:hyperlink w:history="1" r:id="rIdcg3bownx5arlyieod6jzq">
+      <w:hyperlink w:history="1" r:id="rIde4ptain7gczhl81i__foj">
         <w:r>
           <w:rPr>
             <w:rStyle w:val="Hyperlink"/>
@@ -192,7 +192,7 @@
       </w:pPr>
       <w:r>
         <w:rPr>
-          <w:rFonts w:ascii="Verdana" w:cs="Verdana" w:eastAsia="Verdana" w:hAnsi="Verdana"/>
+          <w:rFonts w:ascii="Verdana" w:cs="Verdana" w:hAnsi="Verdana"/>
           <w:b/>
           <w:bCs/>
           <w:i w:val="false"/>
@@ -357,7 +357,7 @@
       <w:bookmarkStart w:name="description" w:id="1"/>
       <w:r>
         <w:rPr>
-          <w:rFonts w:ascii="Verdana" w:cs="Verdana" w:eastAsia="Verdana" w:hAnsi="Verdana"/>
+          <w:rFonts w:ascii="Verdana" w:cs="Verdana" w:hAnsi="Verdana"/>
           <w:b/>
           <w:bCs/>
           <w:i w:val="false"/>
@@ -395,7 +395,7 @@
       <w:bookmarkStart w:name="skill" w:id="2"/>
       <w:r>
         <w:rPr>
-          <w:rFonts w:ascii="Verdana" w:cs="Verdana" w:eastAsia="Verdana" w:hAnsi="Verdana"/>
+          <w:rFonts w:ascii="Verdana" w:cs="Verdana" w:hAnsi="Verdana"/>
           <w:b/>
           <w:bCs/>
           <w:i w:val="false"/>
@@ -425,7 +425,7 @@
       <w:bookmarkStart w:name="size" w:id="3"/>
       <w:r>
         <w:rPr>
-          <w:rFonts w:ascii="Verdana" w:cs="Verdana" w:eastAsia="Verdana" w:hAnsi="Verdana"/>
+          <w:rFonts w:ascii="Verdana" w:cs="Verdana" w:hAnsi="Verdana"/>
           <w:b/>
           <w:bCs/>
           <w:i w:val="false"/>
@@ -502,7 +502,7 @@
       <w:bookmarkStart w:name="materials" w:id="4"/>
       <w:r>
         <w:rPr>
-          <w:rFonts w:ascii="Verdana" w:cs="Verdana" w:eastAsia="Verdana" w:hAnsi="Verdana"/>
+          <w:rFonts w:ascii="Verdana" w:cs="Verdana" w:hAnsi="Verdana"/>
           <w:b/>
           <w:bCs/>
           <w:i w:val="false"/>
@@ -615,7 +615,7 @@
       <w:bookmarkStart w:name="counts" w:id="5"/>
       <w:r>
         <w:rPr>
-          <w:rFonts w:ascii="Verdana" w:cs="Verdana" w:eastAsia="Verdana" w:hAnsi="Verdana"/>
+          <w:rFonts w:ascii="Verdana" w:cs="Verdana" w:hAnsi="Verdana"/>
           <w:b/>
           <w:bCs/>
           <w:i w:val="false"/>
@@ -708,7 +708,7 @@
       <w:bookmarkStart w:name="backloop" w:id="6"/>
       <w:r>
         <w:rPr>
-          <w:rFonts w:ascii="Verdana" w:cs="Verdana" w:eastAsia="Verdana" w:hAnsi="Verdana"/>
+          <w:rFonts w:ascii="Verdana" w:cs="Verdana" w:hAnsi="Verdana"/>
           <w:b/>
           <w:bCs/>
           <w:i w:val="false"/>
@@ -754,7 +754,7 @@
       <w:bookmarkStart w:name="instructions" w:id="7"/>
       <w:r>
         <w:rPr>
-          <w:rFonts w:ascii="Verdana" w:cs="Verdana" w:eastAsia="Verdana" w:hAnsi="Verdana"/>
+          <w:rFonts w:ascii="Verdana" w:cs="Verdana" w:hAnsi="Verdana"/>
           <w:b/>
           <w:bCs/>
           <w:i w:val="false"/>
@@ -775,7 +775,7 @@
       </w:pPr>
       <w:r>
         <w:rPr>
-          <w:rFonts w:ascii="Verdana" w:cs="Verdana" w:eastAsia="Verdana" w:hAnsi="Verdana"/>
+          <w:rFonts w:ascii="Verdana" w:cs="Verdana" w:hAnsi="Verdana"/>
           <w:b/>
           <w:bCs/>
           <w:i w:val="false"/>
@@ -821,7 +821,7 @@
       </w:pPr>
       <w:r>
         <w:rPr>
-          <w:rFonts w:ascii="Verdana" w:cs="Verdana" w:eastAsia="Verdana" w:hAnsi="Verdana"/>
+          <w:rFonts w:ascii="Verdana" w:cs="Verdana" w:hAnsi="Verdana"/>
           <w:b/>
           <w:bCs/>
           <w:i w:val="false"/>
@@ -901,7 +901,7 @@
       </w:pPr>
       <w:r>
         <w:rPr>
-          <w:rFonts w:ascii="Verdana" w:cs="Verdana" w:eastAsia="Verdana" w:hAnsi="Verdana"/>
+          <w:rFonts w:ascii="Verdana" w:cs="Verdana" w:hAnsi="Verdana"/>
           <w:b/>
           <w:bCs/>
           <w:i w:val="false"/>
@@ -976,7 +976,7 @@
       </w:pPr>
       <w:r>
         <w:rPr>
-          <w:rFonts w:ascii="Verdana" w:cs="Verdana" w:eastAsia="Verdana" w:hAnsi="Verdana"/>
+          <w:rFonts w:ascii="Verdana" w:cs="Verdana" w:hAnsi="Verdana"/>
           <w:b/>
           <w:bCs/>
           <w:i w:val="false"/>
@@ -1020,7 +1020,7 @@
       </w:pPr>
       <w:r>
         <w:rPr>
-          <w:rFonts w:ascii="Verdana" w:cs="Verdana" w:eastAsia="Verdana" w:hAnsi="Verdana"/>
+          <w:rFonts w:ascii="Verdana" w:cs="Verdana" w:hAnsi="Verdana"/>
           <w:b/>
           <w:bCs/>
           <w:i w:val="false"/>
@@ -1092,7 +1092,7 @@
       </w:pPr>
       <w:r>
         <w:rPr>
-          <w:rFonts w:ascii="Verdana" w:cs="Verdana" w:eastAsia="Verdana" w:hAnsi="Verdana"/>
+          <w:rFonts w:ascii="Verdana" w:cs="Verdana" w:hAnsi="Verdana"/>
           <w:b/>
           <w:bCs/>
           <w:i w:val="false"/>
@@ -1177,7 +1177,7 @@
       </w:pPr>
       <w:r>
         <w:rPr>
-          <w:rFonts w:ascii="Verdana" w:cs="Verdana" w:eastAsia="Verdana" w:hAnsi="Verdana"/>
+          <w:rFonts w:ascii="Verdana" w:cs="Verdana" w:hAnsi="Verdana"/>
           <w:b/>
           <w:bCs/>
           <w:i w:val="false"/>
@@ -1237,7 +1237,7 @@
       <w:bookmarkStart w:name="terms" w:id="8"/>
       <w:r>
         <w:rPr>
-          <w:rFonts w:ascii="Verdana" w:cs="Verdana" w:eastAsia="Verdana" w:hAnsi="Verdana"/>
+          <w:rFonts w:ascii="Verdana" w:cs="Verdana" w:hAnsi="Verdana"/>
           <w:b/>
           <w:bCs/>
           <w:i w:val="false"/>
@@ -1451,7 +1451,7 @@
         <w:ind w:left="720" w:hanging="403"/>
       </w:pPr>
       <w:rPr>
-        <w:rFonts w:ascii="Verdana" w:cs="Verdana" w:eastAsia="Verdana" w:hAnsi="Verdana"/>
+        <w:rFonts w:ascii="Verdana" w:cs="Verdana" w:hAnsi="Verdana"/>
         <w:color w:val="000000"/>
         <w:sz w:val="48"/>
         <w:szCs w:val="48"/>
@@ -1469,7 +1469,7 @@
         <w:ind w:left="863" w:hanging="547"/>
       </w:pPr>
       <w:rPr>
-        <w:rFonts w:ascii="Verdana" w:cs="Verdana" w:eastAsia="Verdana" w:hAnsi="Verdana"/>
+        <w:rFonts w:ascii="Verdana" w:cs="Verdana" w:hAnsi="Verdana"/>
         <w:color w:val="000000"/>
         <w:sz w:val="48"/>
         <w:szCs w:val="48"/>
@@ -1532,13 +1532,13 @@
   <w:docDefaults>
     <w:rPrDefault>
       <w:rPr>
-        <w:rFonts w:ascii="Verdana" w:cs="Verdana" w:eastAsia="Verdana" w:hAnsi="Verdana"/>
+        <w:rFonts w:ascii="Verdana" w:cs="Verdana" w:hAnsi="Verdana"/>
         <w:i w:val="false"/>
         <w:iCs w:val="false"/>
         <w:color w:val="000000"/>
         <w:sz w:val="48"/>
         <w:szCs w:val="48"/>
-        <w:lang w:val="en-GB"/>
+        <w:lang w:val="en-GB" w:bidi="en-GB"/>
       </w:rPr>
     </w:rPrDefault>
     <w:pPrDefault>

</xml_diff>

<commit_message>
Make the English accessible edition match the Hindi one
The two are translations of each other, so the section that lists the
stitches is named the same in both: Crochet stitches used. Single
crochet into the back loop joins the list, since it is worked on every
row after the first and is what makes the ribbing. The level word at
the head of the sentence goes.

English Word file and large print PDF rebuilt. PDF passes every check.

Co-Authored-By: Claude Opus 5 <noreply@anthropic.com>
</commit_message>
<xml_diff>
--- a/crochet-curio/assets/patterns/rosie-beanie-pattern-large-print.docx
+++ b/crochet-curio/assets/patterns/rosie-beanie-pattern-large-print.docx
@@ -226,7 +226,7 @@
         </w:rPr>
         <w:t xml:space="preserve">If anything in this pattern is wrong, unclear, or does not read properly with your screen reader, please write to </w:t>
       </w:r>
-      <w:hyperlink w:history="1" r:id="rIdr4q7dmv2ngogx3jbalqcw">
+      <w:hyperlink w:history="1" r:id="rIds-85khpc1lxxvpy9orxr4">
         <w:r>
           <w:rPr>
             <w:rStyle w:val="Hyperlink"/>
@@ -297,7 +297,7 @@
             <w:rStyle w:val="Hyperlink"/>
             <w:lang w:val="en-GB" w:bidi="en-GB"/>
           </w:rPr>
-          <w:t xml:space="preserve">Skill level</w:t>
+          <w:t xml:space="preserve">Crochet stitches used</w:t>
         </w:r>
       </w:hyperlink>
     </w:p>
@@ -479,7 +479,7 @@
           <w:szCs w:val="30"/>
           <w:lang w:val="en-GB" w:bidi="en-GB"/>
         </w:rPr>
-        <w:t xml:space="preserve">Skill level</w:t>
+        <w:t xml:space="preserve">Crochet stitches used</w:t>
       </w:r>
       <w:bookmarkEnd w:id="2"/>
     </w:p>
@@ -491,7 +491,7 @@
         <w:rPr>
           <w:lang w:val="en-GB" w:bidi="en-GB"/>
         </w:rPr>
-        <w:t xml:space="preserve">Beginner. You need to chain, single crochet, slip stitch, and gather the top closed with a needle.</w:t>
+        <w:t xml:space="preserve">You need to chain, single crochet, single crochet into the back loop, slip stitch, and gather the top closed with a needle.</w:t>
       </w:r>
     </w:p>
     <w:p>

</xml_diff>